<commit_message>
Starting to use jsons
</commit_message>
<xml_diff>
--- a/Симулятор эволюции бактерий.docx
+++ b/Симулятор эволюции бактерий.docx
@@ -1841,7 +1841,10 @@
         <w:t>1. 26.02.26</w:t>
       </w:r>
       <w:r>
-        <w:t>. Ознакомление с задачей</w:t>
+        <w:t>.</w:t>
+      </w:r>
+      <w:r>
+        <w:t xml:space="preserve"> Ознакомление с задачей</w:t>
       </w:r>
     </w:p>
     <w:p>
@@ -1858,7 +1861,10 @@
         <w:t>2.03.26</w:t>
       </w:r>
       <w:r>
-        <w:t>. Предоставление плана</w:t>
+        <w:t>.</w:t>
+      </w:r>
+      <w:r>
+        <w:t xml:space="preserve"> Предоставление плана</w:t>
       </w:r>
     </w:p>
     <w:p>
@@ -1872,6 +1878,32 @@
         <w:t xml:space="preserve"> </w:t>
       </w:r>
       <w:r>
+        <w:t>26.03.26</w:t>
+      </w:r>
+      <w:r>
+        <w:t>.</w:t>
+      </w:r>
+      <w:r>
+        <w:t xml:space="preserve"> </w:t>
+      </w:r>
+      <w:r>
+        <w:t>Реализация ядра с</w:t>
+      </w:r>
+      <w:r>
+        <w:t>имулятора</w:t>
+      </w:r>
+    </w:p>
+    <w:p>
+      <w:pPr>
+        <w:spacing w:after="0"/>
+      </w:pPr>
+      <w:r>
+        <w:t>4.</w:t>
+      </w:r>
+      <w:r>
+        <w:t xml:space="preserve"> </w:t>
+      </w:r>
+      <w:r>
         <w:rPr>
           <w:highlight w:val="yellow"/>
         </w:rPr>
@@ -1881,18 +1913,21 @@
         <w:t xml:space="preserve"> </w:t>
       </w:r>
       <w:r>
-        <w:t>Реализация ядра с</w:t>
-      </w:r>
-      <w:r>
-        <w:t>имулятора</w:t>
-      </w:r>
-    </w:p>
-    <w:p>
-      <w:pPr>
-        <w:spacing w:after="0"/>
-      </w:pPr>
-      <w:r>
-        <w:t>4.</w:t>
+        <w:t xml:space="preserve">Реализация </w:t>
+      </w:r>
+      <w:r>
+        <w:t>сохранения данных для визуализации</w:t>
+      </w:r>
+    </w:p>
+    <w:p>
+      <w:pPr>
+        <w:spacing w:after="0"/>
+      </w:pPr>
+      <w:r>
+        <w:t>5</w:t>
+      </w:r>
+      <w:r>
+        <w:t>.</w:t>
       </w:r>
       <w:r>
         <w:t xml:space="preserve"> </w:t>
@@ -1907,29 +1942,46 @@
         <w:t xml:space="preserve"> </w:t>
       </w:r>
       <w:r>
-        <w:t>Реализация б</w:t>
-      </w:r>
-      <w:r>
-        <w:t>актери</w:t>
-      </w:r>
-      <w:r>
-        <w:t>й</w:t>
-      </w:r>
-    </w:p>
-    <w:p>
-      <w:pPr>
-        <w:spacing w:after="0"/>
-      </w:pPr>
-      <w:r>
-        <w:t>5</w:t>
-      </w:r>
-      <w:r>
-        <w:t>.</w:t>
+        <w:t xml:space="preserve">Реализация </w:t>
+      </w:r>
+      <w:r>
+        <w:t>в</w:t>
+      </w:r>
+      <w:r>
+        <w:t>изуализаци</w:t>
+      </w:r>
+      <w:r>
+        <w:t>и</w:t>
+      </w:r>
+    </w:p>
+    <w:p>
+      <w:pPr>
+        <w:spacing w:after="0"/>
+      </w:pPr>
+      <w:r>
+        <w:t xml:space="preserve">6. </w:t>
+      </w:r>
+      <w:r>
+        <w:rPr>
+          <w:highlight w:val="yellow"/>
+        </w:rPr>
+        <w:t>[Дата]</w:t>
       </w:r>
       <w:r>
         <w:t xml:space="preserve"> </w:t>
       </w:r>
       <w:r>
+        <w:t>Запасная лабораторная</w:t>
+      </w:r>
+    </w:p>
+    <w:p>
+      <w:pPr>
+        <w:spacing w:after="0"/>
+      </w:pPr>
+      <w:r>
+        <w:t xml:space="preserve">7. </w:t>
+      </w:r>
+      <w:r>
         <w:rPr>
           <w:highlight w:val="yellow"/>
         </w:rPr>
@@ -1939,53 +1991,7 @@
         <w:t xml:space="preserve"> </w:t>
       </w:r>
       <w:r>
-        <w:t>Реализация еды</w:t>
-      </w:r>
-    </w:p>
-    <w:p>
-      <w:pPr>
-        <w:spacing w:after="0"/>
-      </w:pPr>
-      <w:r>
-        <w:t xml:space="preserve">6. </w:t>
-      </w:r>
-      <w:r>
-        <w:rPr>
-          <w:highlight w:val="yellow"/>
-        </w:rPr>
-        <w:t>[Дата]</w:t>
-      </w:r>
-      <w:r>
-        <w:t xml:space="preserve"> </w:t>
-      </w:r>
-      <w:r>
-        <w:t>Реализация в</w:t>
-      </w:r>
-      <w:r>
-        <w:t>изуализаци</w:t>
-      </w:r>
-      <w:r>
-        <w:t>и</w:t>
-      </w:r>
-    </w:p>
-    <w:p>
-      <w:pPr>
-        <w:spacing w:after="0"/>
-      </w:pPr>
-      <w:r>
-        <w:t xml:space="preserve">7. </w:t>
-      </w:r>
-      <w:r>
-        <w:rPr>
-          <w:highlight w:val="yellow"/>
-        </w:rPr>
-        <w:t>[Дата]</w:t>
-      </w:r>
-      <w:r>
-        <w:t xml:space="preserve"> </w:t>
-      </w:r>
-      <w:r>
-        <w:t>Презентация</w:t>
+        <w:t>Запасная лабораторная</w:t>
       </w:r>
     </w:p>
     <w:p>

</xml_diff>